<commit_message>
Spanish templates: more files in progress
Co-Authored-By: Claude Opus 5.5 <noreply@anthropic.com>
Claude-Session: https://claude.ai/code/session_012WEC1qutQtsV9VUQGDVAHW
</commit_message>
<xml_diff>
--- a/assets/legal-templates/es/policy-approval-and-review-procedure.docx
+++ b/assets/legal-templates/es/policy-approval-and-review-procedure.docx
@@ -19,7 +19,7 @@
             <wp:extent cx="7562850" cy="10696575"/>
             <wp:effectExtent t="0" r="0" b="0" l="0"/>
             <wp:wrapNone/>
-            <wp:docPr id="1" name="" descr="" title=""/>
+            <wp:docPr id="3" name="" descr="" title=""/>
             <wp:cNvGraphicFramePr>
               <a:graphicFrameLocks xmlns:a="http://schemas.openxmlformats.org/drawingml/2006/main" noChangeAspect="1"/>
             </wp:cNvGraphicFramePr>
@@ -7078,7 +7078,7 @@
                 <w:sz w:val="19"/>
                 <w:szCs w:val="19"/>
               </w:rPr>
-              <w:t xml:space="preserve">Sé proporcional y respetuoso. Las pequeñas organizaciones socias locales pueden tener buenas prácticas pero pocos documentos escritos. Ofrece plantillas, tiempo y apoyo en lugar de limitarte a exigir papeles, y acepta la política propia de una organización socia cuando cumpla el mismo estándar. Cuando un financiador exija que sus reglas se trasladen a las organizaciones socias, indícalo en el acuerdo.</w:t>
+              <w:t xml:space="preserve">Actúa con proporcionalidad y respeto. Las pequeñas organizaciones socias locales pueden tener buenas prácticas pero pocos documentos escritos. Ofrece plantillas, tiempo y apoyo en lugar de limitarte a exigir papeles, y acepta la política propia de una organización socia cuando cumpla el mismo estándar. Cuando un financiador exija que sus reglas se trasladen a las organizaciones socias, indícalo en el acuerdo.</w:t>
             </w:r>
           </w:p>
         </w:tc>
@@ -14268,7 +14268,7 @@
         <wp:inline distT="0" distB="0" distL="0" distR="0">
           <wp:extent cx="1333500" cy="204788"/>
           <wp:effectExtent t="0" r="0" b="0" l="0"/>
-          <wp:docPr id="2" name="" descr="" title=""/>
+          <wp:docPr id="4" name="" descr="" title=""/>
           <wp:cNvGraphicFramePr>
             <a:graphicFrameLocks xmlns:a="http://schemas.openxmlformats.org/drawingml/2006/main" noChangeAspect="1"/>
           </wp:cNvGraphicFramePr>

</xml_diff>

<commit_message>
Spanish templates: in progress
Co-Authored-By: Claude Opus 5.5 <noreply@anthropic.com>
Claude-Session: https://claude.ai/code/session_012WEC1qutQtsV9VUQGDVAHW
</commit_message>
<xml_diff>
--- a/assets/legal-templates/es/policy-approval-and-review-procedure.docx
+++ b/assets/legal-templates/es/policy-approval-and-review-procedure.docx
@@ -19,7 +19,7 @@
             <wp:extent cx="7562850" cy="10696575"/>
             <wp:effectExtent t="0" r="0" b="0" l="0"/>
             <wp:wrapNone/>
-            <wp:docPr id="3" name="" descr="" title=""/>
+            <wp:docPr id="1" name="" descr="" title=""/>
             <wp:cNvGraphicFramePr>
               <a:graphicFrameLocks xmlns:a="http://schemas.openxmlformats.org/drawingml/2006/main" noChangeAspect="1"/>
             </wp:cNvGraphicFramePr>
@@ -14268,7 +14268,7 @@
         <wp:inline distT="0" distB="0" distL="0" distR="0">
           <wp:extent cx="1333500" cy="204788"/>
           <wp:effectExtent t="0" r="0" b="0" l="0"/>
-          <wp:docPr id="4" name="" descr="" title=""/>
+          <wp:docPr id="2" name="" descr="" title=""/>
           <wp:cNvGraphicFramePr>
             <a:graphicFrameLocks xmlns:a="http://schemas.openxmlformats.org/drawingml/2006/main" noChangeAspect="1"/>
           </wp:cNvGraphicFramePr>

</xml_diff>